<commit_message>
feat(submission): complete P4-MIR + P5-IJOEM packages (missing title/cover); add upload index
- P4 mir_package: add 02_title_page + 03_cover_letter (Springer/MIR, adapted from
  MBR sibling) -> first-submission package now complete.
- P5 ijoem_package: add 02_title_page (Emerald/IJOEM, adapted from CMS sibling).
- dist/SUBMISSION_FINAL/UPLOAD_INDEX.md: per-paper first-submission manifest
  (files, VI, house style, pending author gates, readiness order).
- Flag P3 jabs (stub) + P6 ibr (legacy) as non-blocking incomplete packages.
</commit_message>
<xml_diff>
--- a/p4/submission/mir_package/03_cover_letter.docx
+++ b/p4/submission/mir_package/03_cover_letter.docx
@@ -2,20 +2,65 @@
 <file path=word/document.xml><?xml version="1.0" encoding="utf-8"?>
 <w:document xmlns:w="http://schemas.openxmlformats.org/wordprocessingml/2006/main" xmlns:m="http://schemas.openxmlformats.org/officeDocument/2006/math" xmlns:r="http://schemas.openxmlformats.org/officeDocument/2006/relationships" xmlns:o="urn:schemas-microsoft-com:office:office" xmlns:v="urn:schemas-microsoft-com:vml" xmlns:w10="urn:schemas-microsoft-com:office:word" xmlns:a="http://schemas.openxmlformats.org/drawingml/2006/main" xmlns:pic="http://schemas.openxmlformats.org/drawingml/2006/picture" xmlns:wp="http://schemas.openxmlformats.org/drawingml/2006/wordprocessingDrawing">
   <w:body>
+    <w:bookmarkStart w:id="21" w:name="X89b5f3ba5bba408b82921015e95d86c099effac"/>
     <w:p>
       <w:pPr>
-        <w:pStyle w:val="FirstParagraph"/>
-      </w:pPr>
-      <w:r>
-        <w:t xml:space="preserve">10 May 2026</w:t>
+        <w:pStyle w:val="Heading1"/>
+      </w:pPr>
+      <w:r>
+        <w:t xml:space="preserve">Cover Letter, Management International Review</w:t>
       </w:r>
     </w:p>
     <w:p>
       <w:pPr>
+        <w:pStyle w:val="FirstParagraph"/>
+      </w:pPr>
+      <w:r>
+        <w:t xml:space="preserve">The Editor-in-Chief</w:t>
+      </w:r>
+      <w:r>
+        <w:t xml:space="preserve"> </w:t>
+      </w:r>
+      <w:r>
+        <w:t xml:space="preserve">Management International Review (MIR)</w:t>
+      </w:r>
+      <w:r>
+        <w:t xml:space="preserve"> </w:t>
+      </w:r>
+      <w:r>
+        <w:t xml:space="preserve">Springer Nature</w:t>
+      </w:r>
+    </w:p>
+    <w:p>
+      <w:pPr>
         <w:pStyle w:val="BodyText"/>
       </w:pPr>
       <w:r>
-        <w:t xml:space="preserve">The Editor-in-Chief</w:t>
+        <w:t xml:space="preserve">Dear Editor-in-Chief,</w:t>
+      </w:r>
+    </w:p>
+    <w:p>
+      <w:pPr>
+        <w:pStyle w:val="BodyText"/>
+      </w:pPr>
+      <w:r>
+        <w:t xml:space="preserve">We are pleased to submit our manuscript,</w:t>
+      </w:r>
+      <w:r>
+        <w:t xml:space="preserve"> </w:t>
+      </w:r>
+      <w:r>
+        <w:rPr>
+          <w:bCs/>
+          <w:b/>
+        </w:rPr>
+        <w:t xml:space="preserve">"Technological Capability, Digital Adoption, and the Internationalization–Performance Relationship: A Firm-Level Study of Singapore,"</w:t>
+      </w:r>
+      <w:r>
+        <w:t xml:space="preserve"> </w:t>
+      </w:r>
+      <w:r>
+        <w:t xml:space="preserve">for consideration in</w:t>
       </w:r>
       <w:r>
         <w:t xml:space="preserve"> </w:t>
@@ -25,32 +70,26 @@
           <w:iCs/>
           <w:i/>
         </w:rPr>
-        <w:t xml:space="preserve">Management International Review</w:t>
-      </w:r>
-      <w:r>
-        <w:t xml:space="preserve"> </w:t>
-      </w:r>
-      <w:r>
-        <w:t xml:space="preserve">Springer</w:t>
+        <w:t xml:space="preserve">Management International Review (MIR)</w:t>
+      </w:r>
+      <w:r>
+        <w:t xml:space="preserve">.</w:t>
       </w:r>
     </w:p>
     <w:p>
-      <w:r>
-        <w:pict>
-          <v:rect style="width:0;height:1.5pt" o:hralign="center" o:hrstd="t" o:hr="t"/>
-        </w:pict>
+      <w:pPr>
+        <w:pStyle w:val="BodyText"/>
+      </w:pPr>
+      <w:r>
+        <w:t xml:space="preserve">We examine how technological capability and digital adoption condition the I–P relationship among firms in Singapore, an advanced-economy boundary case, using WBES B-READY 2023 data.</w:t>
       </w:r>
     </w:p>
     <w:p>
       <w:pPr>
-        <w:pStyle w:val="FirstParagraph"/>
-      </w:pPr>
-      <w:r>
-        <w:rPr>
-          <w:bCs/>
-          <w:b/>
-        </w:rPr>
-        <w:t xml:space="preserve">Submission of Manuscript: "Technological Capability, Digital Adoption, and the Internationalisation–Performance Relationship: A Firm-Level Study of Singapore"</w:t>
+        <w:pStyle w:val="BodyText"/>
+      </w:pPr>
+      <w:r>
+        <w:t xml:space="preserve">This study fits MIR's focus on rigorous, theory-driven international business and management research, particularly work that examines the boundary conditions of the internationalization–performance relationship and the role of firm-level technological capability in international strategy. We believe it offers a clear contribution and a good fit for your readership.</w:t>
       </w:r>
     </w:p>
     <w:p>
@@ -58,7 +97,7 @@
         <w:pStyle w:val="BodyText"/>
       </w:pPr>
       <w:r>
-        <w:t xml:space="preserve">Dear Editor-in-Chief,</w:t>
+        <w:t xml:space="preserve">The manuscript is original, has not been published, and is not under consideration elsewhere. All authors approved the submission and declare no conflicts of interest. We confirm the use of a writing-assistance tool (Grammarly) for language only; no generative AI produced substantive content.</w:t>
       </w:r>
     </w:p>
     <w:p>
@@ -66,23 +105,7 @@
         <w:pStyle w:val="BodyText"/>
       </w:pPr>
       <w:r>
-        <w:t xml:space="preserve">We are pleased to submit the above manuscript for consideration for publication in</w:t>
-      </w:r>
-      <w:r>
-        <w:t xml:space="preserve"> </w:t>
-      </w:r>
-      <w:r>
-        <w:rPr>
-          <w:iCs/>
-          <w:i/>
-        </w:rPr>
-        <w:t xml:space="preserve">Management International Review</w:t>
-      </w:r>
-      <w:r>
-        <w:t xml:space="preserve"> </w:t>
-      </w:r>
-      <w:r>
-        <w:t xml:space="preserve">(MIR). The manuscript presents an empirical study of the internationalisation–performance (I–P) relationship using World Bank Enterprise Survey microdata for Singapore (2023; N = 623, N = 617 for specifications including DAI), positioned as an analytically informative boundary-case test at the advanced-economy ceiling of the institutional spectrum.</w:t>
+        <w:t xml:space="preserve">Thank you for your consideration.</w:t>
       </w:r>
     </w:p>
     <w:p>
@@ -90,272 +113,18 @@
         <w:pStyle w:val="BodyText"/>
       </w:pPr>
       <w:r>
-        <w:rPr>
-          <w:bCs/>
-          <w:b/>
-        </w:rPr>
-        <w:t xml:space="preserve">Relevance to MIR</w:t>
-      </w:r>
-    </w:p>
-    <w:p>
-      <w:pPr>
-        <w:pStyle w:val="BodyText"/>
-      </w:pPr>
-      <w:r>
-        <w:t xml:space="preserve">The study speaks directly to MIR's interest in international business theory across diverse institutional settings. Singapore is an ideal stress-test setting for the I–P relationship because near-universal digital diffusion — what the paper terms the</w:t>
+        <w:t xml:space="preserve">Sincerely,</w:t>
       </w:r>
       <w:r>
         <w:t xml:space="preserve"> </w:t>
       </w:r>
       <w:r>
-        <w:rPr>
-          <w:iCs/>
-          <w:i/>
-        </w:rPr>
-        <w:t xml:space="preserve">digital saturation paradox</w:t>
+        <w:t xml:space="preserve">Phan Anh Tú (corresponding author), College of Economics, Can Tho University, Vietnam ·</w:t>
       </w:r>
       <w:r>
         <w:t xml:space="preserve"> </w:t>
       </w:r>
-      <w:r>
-        <w:t xml:space="preserve">— removes the uniform-premium effect of foundational digital adoption and leaves only the export-contingent signal legible. Singapore's advanced-economy positioning is empirically well-established: it ranks 2nd globally in the StartupBlink Innovators Business Environment Index 2026 (score 99.145 out of 100; 1st in Asia Pacific across 30+ governance, capital access, taxation, and digital-infrastructure parameters), 4th in the Global Startup Ecosystem Index 2025, and 3rd in the United Nations e-Government Survey 2024, with the Smart Nation 2.0 initiative (2024) formalising digital trust and growth as national policy pillars. This configuration provides a theoretically precise complement to I–P studies in emerging-economy settings and advances MIR's sustained focus on how institutional and digital environments condition the returns to internationalisation.</w:t>
-      </w:r>
-    </w:p>
-    <w:p>
-      <w:pPr>
-        <w:pStyle w:val="BodyText"/>
-      </w:pPr>
-      <w:r>
-        <w:rPr>
-          <w:bCs/>
-          <w:b/>
-        </w:rPr>
-        <w:t xml:space="preserve">Key Contributions</w:t>
-      </w:r>
-    </w:p>
-    <w:p>
-      <w:pPr>
-        <w:pStyle w:val="BodyText"/>
-      </w:pPr>
-      <w:r>
-        <w:t xml:space="preserve">First, within the observed export-intensity range, the I–P relationship in Singapore is better characterised as predominantly positive with mild quadratic curvature than as a formally identified inverted-U. The fitted quadratic implies a turning point in the upper tail (~88% export intensity), but that point falls in a sparsely populated region of the data — consistent with theoretical expectations that advanced-economy digital infrastructure attenuates the coordination-cost mechanism underlying the classic inverted-U until very high levels of export intensity.</w:t>
-      </w:r>
-    </w:p>
-    <w:p>
-      <w:pPr>
-        <w:pStyle w:val="BodyText"/>
-      </w:pPr>
-      <w:r>
-        <w:t xml:space="preserve">Second, the study introduces the concept of a</w:t>
-      </w:r>
-      <w:r>
-        <w:t xml:space="preserve"> </w:t>
-      </w:r>
-      <w:r>
-        <w:rPr>
-          <w:iCs/>
-          <w:i/>
-        </w:rPr>
-        <w:t xml:space="preserve">digital saturation paradox</w:t>
-      </w:r>
-      <w:r>
-        <w:t xml:space="preserve">: in an environment where Tier 1–2 digital interfaces (websites, electronic payment systems) are already widely diffused, foundational digital adoption functions as a hygiene factor for domestic operations rather than a differentiating asset. DAI's productivity association becomes measurable primarily in the high-export tail (β₅ for FSTS²×DAI = +3.119, p = .005), suggesting that digital adoption operates as a contingent scaling resource rather than a uniform productivity premium.</w:t>
-      </w:r>
-    </w:p>
-    <w:p>
-      <w:pPr>
-        <w:pStyle w:val="BodyText"/>
-      </w:pPr>
-      <w:r>
-        <w:t xml:space="preserve">Third, the study provides the clearest empirical separation to date between Technological Capability Index (TCI; quality certification, R&amp;D, product innovation, foreign-licensed technology) and Digital Adoption Index (DAI; website presence, electronic payment) as non-overlapping constructs in a WBES-based I–P study — a design feature that directly operationalises the Conditional Digital Capability Moderation (CDCM) framework.</w:t>
-      </w:r>
-    </w:p>
-    <w:p>
-      <w:pPr>
-        <w:pStyle w:val="BodyText"/>
-      </w:pPr>
-      <w:r>
-        <w:rPr>
-          <w:bCs/>
-          <w:b/>
-        </w:rPr>
-        <w:t xml:space="preserve">Originality and Conflicts of Interest</w:t>
-      </w:r>
-    </w:p>
-    <w:p>
-      <w:pPr>
-        <w:pStyle w:val="BodyText"/>
-      </w:pPr>
-      <w:r>
-        <w:t xml:space="preserve">This manuscript is original, has not been published previously, and is not under consideration for publication elsewhere. All authors have approved the manuscript and agree to its submission. The authors declare no conflict of interest. This research received no specific grant from any funding agency in the public, commercial, or not-for-profit sectors.</w:t>
-      </w:r>
-    </w:p>
-    <w:p>
-      <w:pPr>
-        <w:pStyle w:val="BodyText"/>
-      </w:pPr>
-      <w:r>
-        <w:rPr>
-          <w:bCs/>
-          <w:b/>
-        </w:rPr>
-        <w:t xml:space="preserve">Manuscript Classification</w:t>
-      </w:r>
-    </w:p>
-    <w:p>
-      <w:pPr>
-        <w:numPr>
-          <w:ilvl w:val="0"/>
-          <w:numId w:val="1001"/>
-        </w:numPr>
-        <w:pStyle w:val="Compact"/>
-      </w:pPr>
-      <w:r>
-        <w:t xml:space="preserve">Paper type: Research article</w:t>
-      </w:r>
-    </w:p>
-    <w:p>
-      <w:pPr>
-        <w:numPr>
-          <w:ilvl w:val="0"/>
-          <w:numId w:val="1001"/>
-        </w:numPr>
-        <w:pStyle w:val="Compact"/>
-      </w:pPr>
-      <w:r>
-        <w:t xml:space="preserve">Word count (main text, excluding abstract, references, tables, and figures): approximately 6,500 words</w:t>
-      </w:r>
-    </w:p>
-    <w:p>
-      <w:pPr>
-        <w:numPr>
-          <w:ilvl w:val="0"/>
-          <w:numId w:val="1001"/>
-        </w:numPr>
-        <w:pStyle w:val="Compact"/>
-      </w:pPr>
-      <w:r>
-        <w:t xml:space="preserve">Keywords: internationalisation–performance relationship; digital adoption; technological capability; export intensity; labour productivity; Singapore</w:t>
-      </w:r>
-    </w:p>
-    <w:p>
-      <w:pPr>
-        <w:numPr>
-          <w:ilvl w:val="0"/>
-          <w:numId w:val="1001"/>
-        </w:numPr>
-        <w:pStyle w:val="Compact"/>
-      </w:pPr>
-      <w:r>
-        <w:t xml:space="preserve">JEL classification: F23, O33, L25, O53</w:t>
-      </w:r>
-    </w:p>
-    <w:p>
-      <w:pPr>
-        <w:pStyle w:val="FirstParagraph"/>
-      </w:pPr>
-      <w:r>
-        <w:t xml:space="preserve">We hope the manuscript will be of interest to MIR's readership and look forward to the review process.</w:t>
-      </w:r>
-    </w:p>
-    <w:p>
-      <w:pPr>
-        <w:pStyle w:val="BodyText"/>
-      </w:pPr>
-      <w:r>
-        <w:t xml:space="preserve">Yours sincerely,</w:t>
-      </w:r>
-    </w:p>
-    <w:p>
-      <w:pPr>
-        <w:pStyle w:val="BodyText"/>
-      </w:pPr>
-      <w:r>
-        <w:rPr>
-          <w:bCs/>
-          <w:b/>
-        </w:rPr>
-        <w:t xml:space="preserve">Đỗ Thùy Hương (Do Thuy Huong)</w:t>
-      </w:r>
-      <w:r>
-        <w:t xml:space="preserve"> </w:t>
-      </w:r>
-      <w:r>
-        <w:t xml:space="preserve">PhD Candidate</w:t>
-      </w:r>
-      <w:r>
-        <w:t xml:space="preserve"> </w:t>
-      </w:r>
-      <w:r>
-        <w:t xml:space="preserve">College of Economics, Can Tho University (CTU), Vietnam</w:t>
-      </w:r>
-      <w:r>
-        <w:t xml:space="preserve"> </w:t>
-      </w:r>
-      <w:r>
-        <w:t xml:space="preserve">Email:</w:t>
-      </w:r>
-      <w:r>
-        <w:t xml:space="preserve"> </w:t>
-      </w:r>
       <w:hyperlink r:id="rId20">
-        <w:r>
-          <w:rPr>
-            <w:rStyle w:val="Hyperlink"/>
-          </w:rPr>
-          <w:t xml:space="preserve">huongp1323001@gstudent.ctu.edu.vn</w:t>
-        </w:r>
-      </w:hyperlink>
-      <w:r>
-        <w:t xml:space="preserve"> </w:t>
-      </w:r>
-      <w:r>
-        <w:t xml:space="preserve">| ORCID: 0000-0002-7711-2487</w:t>
-      </w:r>
-    </w:p>
-    <w:p>
-      <w:pPr>
-        <w:pStyle w:val="BodyText"/>
-      </w:pPr>
-      <w:r>
-        <w:rPr>
-          <w:bCs/>
-          <w:b/>
-        </w:rPr>
-        <w:t xml:space="preserve">PGS.TS. Phan Anh Tú (Phan Anh Tu)</w:t>
-      </w:r>
-      <w:r>
-        <w:t xml:space="preserve"> </w:t>
-      </w:r>
-      <w:r>
-        <w:t xml:space="preserve">Associate Professor, College of Economics</w:t>
-      </w:r>
-      <w:r>
-        <w:t xml:space="preserve"> </w:t>
-      </w:r>
-      <w:r>
-        <w:t xml:space="preserve">Can Tho University (CTU), Vietnam</w:t>
-      </w:r>
-      <w:r>
-        <w:t xml:space="preserve"> </w:t>
-      </w:r>
-      <w:r>
-        <w:rPr>
-          <w:iCs/>
-          <w:i/>
-        </w:rPr>
-        <w:t xml:space="preserve">Corresponding author</w:t>
-      </w:r>
-      <w:r>
-        <w:t xml:space="preserve"> </w:t>
-      </w:r>
-      <w:r>
-        <w:t xml:space="preserve">Email:</w:t>
-      </w:r>
-      <w:r>
-        <w:t xml:space="preserve"> </w:t>
-      </w:r>
-      <w:hyperlink r:id="rId21">
         <w:r>
           <w:rPr>
             <w:rStyle w:val="Hyperlink"/>
@@ -363,17 +132,9 @@
           <w:t xml:space="preserve">patu@ctu.edu.vn</w:t>
         </w:r>
       </w:hyperlink>
-      <w:r>
-        <w:t xml:space="preserve"> </w:t>
-      </w:r>
-      <w:r>
-        <w:t xml:space="preserve">| ORCID: 0000-0003-0667-3137</w:t>
-      </w:r>
     </w:p>
-    <w:sectPr>
-      <w:pgSz w:h="16838" w:w="11906"/>
-      <w:pgMar w:bottom="1417" w:left="1417" w:right="1417" w:top="1417"/>
-    </w:sectPr>
+    <w:bookmarkEnd w:id="21"/>
+    <w:sectPr/>
   </w:body>
 </w:document>
 </file>
@@ -479,87 +240,8 @@
       </w:pPr>
     </w:lvl>
   </w:abstractNum>
-  <w:abstractNum w:abstractNumId="991">
-    <w:nsid w:val="A991"/>
-    <w:multiLevelType w:val="multilevel"/>
-    <w:lvl w:ilvl="0">
-      <w:numFmt w:val="bullet"/>
-      <w:lvlText w:val="•"/>
-      <w:lvlJc w:val="left"/>
-      <w:pPr>
-        <w:ind w:left="720" w:hanging="480"/>
-      </w:pPr>
-    </w:lvl>
-    <w:lvl w:ilvl="1">
-      <w:numFmt w:val="bullet"/>
-      <w:lvlText w:val="–"/>
-      <w:lvlJc w:val="left"/>
-      <w:pPr>
-        <w:ind w:left="1440" w:hanging="480"/>
-      </w:pPr>
-    </w:lvl>
-    <w:lvl w:ilvl="2">
-      <w:numFmt w:val="bullet"/>
-      <w:lvlText w:val="•"/>
-      <w:lvlJc w:val="left"/>
-      <w:pPr>
-        <w:ind w:left="2160" w:hanging="480"/>
-      </w:pPr>
-    </w:lvl>
-    <w:lvl w:ilvl="3">
-      <w:numFmt w:val="bullet"/>
-      <w:lvlText w:val="–"/>
-      <w:lvlJc w:val="left"/>
-      <w:pPr>
-        <w:ind w:left="2880" w:hanging="480"/>
-      </w:pPr>
-    </w:lvl>
-    <w:lvl w:ilvl="4">
-      <w:numFmt w:val="bullet"/>
-      <w:lvlText w:val="•"/>
-      <w:lvlJc w:val="left"/>
-      <w:pPr>
-        <w:ind w:left="3600" w:hanging="480"/>
-      </w:pPr>
-    </w:lvl>
-    <w:lvl w:ilvl="5">
-      <w:numFmt w:val="bullet"/>
-      <w:lvlText w:val="–"/>
-      <w:lvlJc w:val="left"/>
-      <w:pPr>
-        <w:ind w:left="4320" w:hanging="480"/>
-      </w:pPr>
-    </w:lvl>
-    <w:lvl w:ilvl="6">
-      <w:numFmt w:val="bullet"/>
-      <w:lvlText w:val="•"/>
-      <w:lvlJc w:val="left"/>
-      <w:pPr>
-        <w:ind w:left="5040" w:hanging="480"/>
-      </w:pPr>
-    </w:lvl>
-    <w:lvl w:ilvl="7">
-      <w:numFmt w:val="bullet"/>
-      <w:lvlText w:val="–"/>
-      <w:lvlJc w:val="left"/>
-      <w:pPr>
-        <w:ind w:left="5760" w:hanging="480"/>
-      </w:pPr>
-    </w:lvl>
-    <w:lvl w:ilvl="8">
-      <w:numFmt w:val="bullet"/>
-      <w:lvlText w:val="•"/>
-      <w:lvlJc w:val="left"/>
-      <w:pPr>
-        <w:ind w:left="6480" w:hanging="480"/>
-      </w:pPr>
-    </w:lvl>
-  </w:abstractNum>
   <w:num w:numId="1000">
     <w:abstractNumId w:val="990"/>
-  </w:num>
-  <w:num w:numId="1001">
-    <w:abstractNumId w:val="991"/>
   </w:num>
 </w:numbering>
 </file>
@@ -585,59 +267,29 @@
   <w:style w:default="1" w:styleId="Normal" w:type="paragraph">
     <w:name w:val="Normal"/>
     <w:qFormat/>
-    <w:pPr>
-      <w:spacing w:line="276" w:lineRule="auto"/>
-      <w:jc w:val="both"/>
-    </w:pPr>
-    <w:rPr>
-      <w:rFonts w:ascii="Times New Roman" w:eastAsia="Times New Roman" w:hAnsi="Times New Roman"/>
-      <w:color w:val="000000"/>
-      <w:sz w:val="24"/>
-    </w:rPr>
   </w:style>
   <w:style w:styleId="BodyText" w:type="paragraph">
     <w:name w:val="Body Text"/>
     <w:basedOn w:val="Normal"/>
     <w:link w:val="BodyTextChar"/>
     <w:pPr>
-      <w:spacing w:after="180" w:before="180" w:line="276" w:lineRule="auto"/>
-      <w:jc w:val="both"/>
-    </w:pPr>
-    <w:qFormat/>
-    <w:rPr>
-      <w:rFonts w:ascii="Times New Roman" w:eastAsia="Times New Roman" w:hAnsi="Times New Roman"/>
-      <w:color w:val="000000"/>
-      <w:sz w:val="24"/>
-    </w:rPr>
+      <w:spacing w:after="180" w:before="180"/>
+    </w:pPr>
+    <w:qFormat/>
   </w:style>
   <w:style w:customStyle="1" w:styleId="FirstParagraph" w:type="paragraph">
     <w:name w:val="First Paragraph"/>
     <w:basedOn w:val="BodyText"/>
     <w:next w:val="BodyText"/>
     <w:qFormat/>
-    <w:pPr>
-      <w:spacing w:line="276" w:lineRule="auto"/>
-      <w:jc w:val="both"/>
-    </w:pPr>
-    <w:rPr>
-      <w:rFonts w:ascii="Times New Roman" w:eastAsia="Times New Roman" w:hAnsi="Times New Roman"/>
-      <w:color w:val="000000"/>
-      <w:sz w:val="24"/>
-    </w:rPr>
   </w:style>
   <w:style w:customStyle="1" w:styleId="Compact" w:type="paragraph">
     <w:name w:val="Compact"/>
     <w:basedOn w:val="BodyText"/>
     <w:qFormat/>
     <w:pPr>
-      <w:spacing w:after="36" w:before="36" w:line="276" w:lineRule="auto"/>
-      <w:jc w:val="both"/>
-    </w:pPr>
-    <w:rPr>
-      <w:rFonts w:ascii="Times New Roman" w:eastAsia="Times New Roman" w:hAnsi="Times New Roman"/>
-      <w:color w:val="000000"/>
-      <w:sz w:val="24"/>
-    </w:rPr>
+      <w:spacing w:after="36" w:before="36"/>
+    </w:pPr>
   </w:style>
   <w:style w:styleId="Title" w:type="paragraph">
     <w:name w:val="Title"/>
@@ -647,15 +299,15 @@
     <w:pPr>
       <w:keepNext/>
       <w:keepLines/>
-      <w:spacing w:after="240" w:before="480" w:line="276" w:lineRule="auto"/>
-      <w:jc w:val="both"/>
-    </w:pPr>
-    <w:rPr>
-      <w:rFonts w:ascii="Times New Roman" w:asciiTheme="majorHAnsi" w:cstheme="majorBidi" w:eastAsia="Times New Roman" w:eastAsiaTheme="majorEastAsia" w:hAnsi="Times New Roman" w:hAnsiTheme="majorHAnsi"/>
+      <w:spacing w:after="240" w:before="480"/>
+      <w:jc w:val="center"/>
+    </w:pPr>
+    <w:rPr>
+      <w:rFonts w:asciiTheme="majorHAnsi" w:cstheme="majorBidi" w:eastAsiaTheme="majorEastAsia" w:hAnsiTheme="majorHAnsi"/>
       <w:b/>
       <w:bCs/>
-      <w:color w:val="000000"/>
-      <w:sz w:val="24"/>
+      <w:color w:themeColor="accent1" w:themeShade="B5" w:val="345A8A"/>
+      <w:sz w:val="36"/>
       <w:szCs w:val="36"/>
     </w:rPr>
   </w:style>
@@ -667,13 +319,11 @@
     <w:pPr>
       <w:keepNext/>
       <w:keepLines/>
-      <w:spacing w:after="240" w:before="240" w:line="276" w:lineRule="auto"/>
-      <w:jc w:val="both"/>
-    </w:pPr>
-    <w:rPr>
-      <w:rFonts w:ascii="Times New Roman" w:eastAsia="Times New Roman" w:hAnsi="Times New Roman"/>
-      <w:color w:val="000000"/>
-      <w:sz w:val="24"/>
+      <w:spacing w:after="240" w:before="240"/>
+      <w:jc w:val="center"/>
+    </w:pPr>
+    <w:rPr>
+      <w:sz w:val="30"/>
       <w:szCs w:val="30"/>
     </w:rPr>
   </w:style>
@@ -684,14 +334,8 @@
     <w:pPr>
       <w:keepNext/>
       <w:keepLines/>
-      <w:spacing w:line="276" w:lineRule="auto"/>
-      <w:jc w:val="both"/>
-    </w:pPr>
-    <w:rPr>
-      <w:rFonts w:ascii="Times New Roman" w:eastAsia="Times New Roman" w:hAnsi="Times New Roman"/>
-      <w:color w:val="000000"/>
-      <w:sz w:val="24"/>
-    </w:rPr>
+      <w:jc w:val="center"/>
+    </w:pPr>
   </w:style>
   <w:style w:styleId="Date" w:type="paragraph">
     <w:name w:val="Date"/>
@@ -700,14 +344,8 @@
     <w:pPr>
       <w:keepNext/>
       <w:keepLines/>
-      <w:spacing w:line="276" w:lineRule="auto"/>
-      <w:jc w:val="both"/>
-    </w:pPr>
-    <w:rPr>
-      <w:rFonts w:ascii="Times New Roman" w:eastAsia="Times New Roman" w:hAnsi="Times New Roman"/>
-      <w:color w:val="000000"/>
-      <w:sz w:val="24"/>
-    </w:rPr>
+      <w:jc w:val="center"/>
+    </w:pPr>
   </w:style>
   <w:style w:customStyle="1" w:styleId="AbstractTitle" w:type="paragraph">
     <w:name w:val="Abstract Title"/>
@@ -717,15 +355,15 @@
     <w:pPr>
       <w:keepNext/>
       <w:keepLines/>
-      <w:jc w:val="both"/>
-      <w:spacing w:after="0" w:before="300" w:line="276" w:lineRule="auto"/>
-    </w:pPr>
-    <w:rPr>
-      <w:color w:val="000000"/>
-      <w:sz w:val="24"/>
+      <w:jc w:val="center"/>
+      <w:spacing w:after="0" w:before="300"/>
+    </w:pPr>
+    <w:rPr>
+      <w:sz w:val="20"/>
       <w:szCs w:val="20"/>
-      <w:rFonts w:ascii="Times New Roman" w:eastAsia="Times New Roman" w:hAnsi="Times New Roman"/>
-      <w:b/>
+      <w:b/>
+      <w:color w:val="345A8A"/>
+      &gt;
     </w:rPr>
   </w:style>
   <w:style w:customStyle="1" w:styleId="Abstract" w:type="paragraph">
@@ -736,13 +374,10 @@
     <w:pPr>
       <w:keepNext/>
       <w:keepLines/>
-      <w:spacing w:after="300" w:before="100" w:line="276" w:lineRule="auto"/>
-      <w:jc w:val="both"/>
-    </w:pPr>
-    <w:rPr>
-      <w:rFonts w:ascii="Times New Roman" w:eastAsia="Times New Roman" w:hAnsi="Times New Roman"/>
-      <w:color w:val="000000"/>
-      <w:sz w:val="24"/>
+      <w:spacing w:after="300" w:before="100"/>
+    </w:pPr>
+    <w:rPr>
+      <w:sz w:val="20"/>
       <w:szCs w:val="20"/>
     </w:rPr>
   </w:style>
@@ -751,15 +386,8 @@
     <w:basedOn w:val="Normal"/>
     <w:next w:val="Bibliography"/>
     <w:qFormat/>
-    <w:pPr>
-      <w:spacing w:line="276" w:lineRule="auto"/>
-      <w:jc w:val="both"/>
-    </w:pPr>
-    <w:rPr>
-      <w:rFonts w:ascii="Times New Roman" w:eastAsia="Times New Roman" w:hAnsi="Times New Roman"/>
-      <w:color w:val="000000"/>
-      <w:sz w:val="24"/>
-    </w:rPr>
+    <w:pPr/>
+    <w:rPr/>
   </w:style>
   <w:style w:styleId="Heading1" w:type="paragraph">
     <w:name w:val="Heading 1"/>
@@ -770,16 +398,15 @@
     <w:pPr>
       <w:keepNext/>
       <w:keepLines/>
-      <w:spacing w:after="0" w:before="480" w:line="276" w:lineRule="auto"/>
-      <w:jc w:val="both"/>
+      <w:spacing w:after="0" w:before="480"/>
       <w:outlineLvl w:val="0"/>
     </w:pPr>
     <w:rPr>
-      <w:rFonts w:ascii="Times New Roman" w:asciiTheme="majorHAnsi" w:cstheme="majorBidi" w:eastAsia="Times New Roman" w:eastAsiaTheme="majorEastAsia" w:hAnsi="Times New Roman" w:hAnsiTheme="majorHAnsi"/>
+      <w:rFonts w:asciiTheme="majorHAnsi" w:cstheme="majorBidi" w:eastAsiaTheme="majorEastAsia" w:hAnsiTheme="majorHAnsi"/>
       <w:b/>
       <w:bCs/>
-      <w:color w:val="000000"/>
-      <w:sz w:val="24"/>
+      <w:color w:themeColor="accent1" w:val="4F81BD"/>
+      <w:sz w:val="32"/>
       <w:szCs w:val="32"/>
     </w:rPr>
   </w:style>
@@ -793,16 +420,15 @@
     <w:pPr>
       <w:keepNext/>
       <w:keepLines/>
-      <w:spacing w:after="0" w:before="200" w:line="276" w:lineRule="auto"/>
-      <w:jc w:val="both"/>
+      <w:spacing w:after="0" w:before="200"/>
       <w:outlineLvl w:val="1"/>
     </w:pPr>
     <w:rPr>
-      <w:rFonts w:ascii="Times New Roman" w:asciiTheme="majorHAnsi" w:cstheme="majorBidi" w:eastAsia="Times New Roman" w:eastAsiaTheme="majorEastAsia" w:hAnsi="Times New Roman" w:hAnsiTheme="majorHAnsi"/>
+      <w:rFonts w:asciiTheme="majorHAnsi" w:cstheme="majorBidi" w:eastAsiaTheme="majorEastAsia" w:hAnsiTheme="majorHAnsi"/>
       <w:b/>
       <w:bCs/>
-      <w:color w:val="000000"/>
-      <w:sz w:val="24"/>
+      <w:color w:themeColor="accent1" w:val="4F81BD"/>
+      <w:sz w:val="28"/>
       <w:szCs w:val="28"/>
     </w:rPr>
   </w:style>
@@ -816,15 +442,14 @@
     <w:pPr>
       <w:keepNext/>
       <w:keepLines/>
-      <w:spacing w:after="0" w:before="200" w:line="276" w:lineRule="auto"/>
-      <w:jc w:val="both"/>
+      <w:spacing w:after="0" w:before="200"/>
       <w:outlineLvl w:val="2"/>
     </w:pPr>
     <w:rPr>
-      <w:rFonts w:ascii="Times New Roman" w:asciiTheme="majorHAnsi" w:cstheme="majorBidi" w:eastAsia="Times New Roman" w:eastAsiaTheme="majorEastAsia" w:hAnsi="Times New Roman" w:hAnsiTheme="majorHAnsi"/>
+      <w:rFonts w:asciiTheme="majorHAnsi" w:cstheme="majorBidi" w:eastAsiaTheme="majorEastAsia" w:hAnsiTheme="majorHAnsi"/>
       <w:b/>
       <w:bCs/>
-      <w:color w:val="000000"/>
+      <w:color w:themeColor="accent1" w:val="4F81BD"/>
       <w:sz w:val="24"/>
       <w:szCs w:val="24"/>
     </w:rPr>
@@ -839,15 +464,14 @@
     <w:pPr>
       <w:keepNext/>
       <w:keepLines/>
-      <w:spacing w:after="0" w:before="200" w:line="276" w:lineRule="auto"/>
-      <w:jc w:val="both"/>
+      <w:spacing w:after="0" w:before="200"/>
       <w:outlineLvl w:val="3"/>
     </w:pPr>
     <w:rPr>
-      <w:rFonts w:ascii="Times New Roman" w:asciiTheme="majorHAnsi" w:cstheme="majorBidi" w:eastAsia="Times New Roman" w:eastAsiaTheme="majorEastAsia" w:hAnsi="Times New Roman" w:hAnsiTheme="majorHAnsi"/>
+      <w:rFonts w:asciiTheme="majorHAnsi" w:cstheme="majorBidi" w:eastAsiaTheme="majorEastAsia" w:hAnsiTheme="majorHAnsi"/>
       <w:i/>
       <w:bCs/>
-      <w:color w:val="000000"/>
+      <w:color w:themeColor="accent1" w:val="4F81BD"/>
       <w:sz w:val="24"/>
       <w:szCs w:val="24"/>
     </w:rPr>
@@ -862,14 +486,13 @@
     <w:pPr>
       <w:keepNext/>
       <w:keepLines/>
-      <w:spacing w:after="0" w:before="200" w:line="276" w:lineRule="auto"/>
-      <w:jc w:val="both"/>
+      <w:spacing w:after="0" w:before="200"/>
       <w:outlineLvl w:val="4"/>
     </w:pPr>
     <w:rPr>
-      <w:rFonts w:ascii="Times New Roman" w:asciiTheme="majorHAnsi" w:cstheme="majorBidi" w:eastAsia="Times New Roman" w:eastAsiaTheme="majorEastAsia" w:hAnsi="Times New Roman" w:hAnsiTheme="majorHAnsi"/>
+      <w:rFonts w:asciiTheme="majorHAnsi" w:cstheme="majorBidi" w:eastAsiaTheme="majorEastAsia" w:hAnsiTheme="majorHAnsi"/>
       <w:iCs/>
-      <w:color w:val="000000"/>
+      <w:color w:themeColor="accent1" w:val="4F81BD"/>
       <w:sz w:val="24"/>
       <w:szCs w:val="24"/>
     </w:rPr>
@@ -884,13 +507,12 @@
     <w:pPr>
       <w:keepNext/>
       <w:keepLines/>
-      <w:spacing w:after="0" w:before="200" w:line="276" w:lineRule="auto"/>
-      <w:jc w:val="both"/>
+      <w:spacing w:after="0" w:before="200"/>
       <w:outlineLvl w:val="5"/>
     </w:pPr>
     <w:rPr>
-      <w:rFonts w:ascii="Times New Roman" w:asciiTheme="majorHAnsi" w:cstheme="majorBidi" w:eastAsia="Times New Roman" w:eastAsiaTheme="majorEastAsia" w:hAnsi="Times New Roman" w:hAnsiTheme="majorHAnsi"/>
-      <w:color w:val="000000"/>
+      <w:rFonts w:asciiTheme="majorHAnsi" w:cstheme="majorBidi" w:eastAsiaTheme="majorEastAsia" w:hAnsiTheme="majorHAnsi"/>
+      <w:color w:themeColor="accent1" w:val="4F81BD"/>
       <w:sz w:val="24"/>
       <w:szCs w:val="24"/>
     </w:rPr>
@@ -905,13 +527,12 @@
     <w:pPr>
       <w:keepNext/>
       <w:keepLines/>
-      <w:spacing w:after="0" w:before="200" w:line="276" w:lineRule="auto"/>
-      <w:jc w:val="both"/>
+      <w:spacing w:after="0" w:before="200"/>
       <w:outlineLvl w:val="6"/>
     </w:pPr>
     <w:rPr>
-      <w:rFonts w:ascii="Times New Roman" w:asciiTheme="majorHAnsi" w:cstheme="majorBidi" w:eastAsia="Times New Roman" w:eastAsiaTheme="majorEastAsia" w:hAnsi="Times New Roman" w:hAnsiTheme="majorHAnsi"/>
-      <w:color w:val="000000"/>
+      <w:rFonts w:asciiTheme="majorHAnsi" w:cstheme="majorBidi" w:eastAsiaTheme="majorEastAsia" w:hAnsiTheme="majorHAnsi"/>
+      <w:color w:themeColor="accent1" w:val="4F81BD"/>
       <w:sz w:val="24"/>
       <w:szCs w:val="24"/>
     </w:rPr>
@@ -926,13 +547,12 @@
     <w:pPr>
       <w:keepNext/>
       <w:keepLines/>
-      <w:spacing w:after="0" w:before="200" w:line="276" w:lineRule="auto"/>
-      <w:jc w:val="both"/>
+      <w:spacing w:after="0" w:before="200"/>
       <w:outlineLvl w:val="7"/>
     </w:pPr>
     <w:rPr>
-      <w:rFonts w:ascii="Times New Roman" w:asciiTheme="majorHAnsi" w:cstheme="majorBidi" w:eastAsia="Times New Roman" w:eastAsiaTheme="majorEastAsia" w:hAnsi="Times New Roman" w:hAnsiTheme="majorHAnsi"/>
-      <w:color w:val="000000"/>
+      <w:rFonts w:asciiTheme="majorHAnsi" w:cstheme="majorBidi" w:eastAsiaTheme="majorEastAsia" w:hAnsiTheme="majorHAnsi"/>
+      <w:color w:themeColor="accent1" w:val="4F81BD"/>
       <w:sz w:val="24"/>
       <w:szCs w:val="24"/>
     </w:rPr>
@@ -947,13 +567,12 @@
     <w:pPr>
       <w:keepNext/>
       <w:keepLines/>
-      <w:spacing w:after="0" w:before="200" w:line="276" w:lineRule="auto"/>
-      <w:jc w:val="both"/>
+      <w:spacing w:after="0" w:before="200"/>
       <w:outlineLvl w:val="8"/>
     </w:pPr>
     <w:rPr>
-      <w:rFonts w:ascii="Times New Roman" w:asciiTheme="majorHAnsi" w:cstheme="majorBidi" w:eastAsia="Times New Roman" w:eastAsiaTheme="majorEastAsia" w:hAnsi="Times New Roman" w:hAnsiTheme="majorHAnsi"/>
-      <w:color w:val="000000"/>
+      <w:rFonts w:asciiTheme="majorHAnsi" w:cstheme="majorBidi" w:eastAsiaTheme="majorEastAsia" w:hAnsiTheme="majorHAnsi"/>
+      <w:color w:themeColor="accent1" w:val="4F81BD"/>
       <w:sz w:val="24"/>
       <w:szCs w:val="24"/>
     </w:rPr>
@@ -966,15 +585,9 @@
     <w:unhideWhenUsed/>
     <w:qFormat/>
     <w:pPr>
-      <w:spacing w:after="100" w:before="100" w:line="276" w:lineRule="auto"/>
+      <w:spacing w:after="100" w:before="100"/>
       <w:ind w:firstLine="0" w:left="480" w:right="480"/>
-      <w:jc w:val="both"/>
-    </w:pPr>
-    <w:rPr>
-      <w:rFonts w:ascii="Times New Roman" w:eastAsia="Times New Roman" w:hAnsi="Times New Roman"/>
-      <w:color w:val="000000"/>
-      <w:sz w:val="24"/>
-    </w:rPr>
+    </w:pPr>
   </w:style>
   <w:style w:styleId="FootnoteText" w:type="paragraph">
     <w:name w:val="Footnote Text"/>
@@ -983,25 +596,11 @@
     <w:uiPriority w:val="9"/>
     <w:unhideWhenUsed/>
     <w:qFormat/>
-    <w:pPr>
-      <w:spacing w:line="276" w:lineRule="auto"/>
-      <w:jc w:val="both"/>
-    </w:pPr>
-    <w:rPr>
-      <w:rFonts w:ascii="Times New Roman" w:eastAsia="Times New Roman" w:hAnsi="Times New Roman"/>
-      <w:color w:val="000000"/>
-      <w:sz w:val="24"/>
-    </w:rPr>
   </w:style>
   <w:style w:default="1" w:styleId="DefaultParagraphFont" w:type="character">
     <w:name w:val="Default Paragraph Font"/>
     <w:semiHidden/>
     <w:unhideWhenUsed/>
-    <w:rPr>
-      <w:rFonts w:ascii="Times New Roman" w:eastAsia="Times New Roman" w:hAnsi="Times New Roman"/>
-      <w:color w:val="000000"/>
-      <w:sz w:val="24"/>
-    </w:rPr>
   </w:style>
   <w:style w:default="1" w:styleId="Table" w:type="table">
     <w:name w:val="Table"/>
@@ -1009,15 +608,6 @@
     <w:semiHidden/>
     <w:unhideWhenUsed/>
     <w:qFormat/>
-    <w:pPr>
-      <w:spacing w:line="276" w:lineRule="auto"/>
-      <w:jc w:val="both"/>
-    </w:pPr>
-    <w:rPr>
-      <w:rFonts w:ascii="Times New Roman" w:eastAsia="Times New Roman" w:hAnsi="Times New Roman"/>
-      <w:color w:val="000000"/>
-      <w:sz w:val="24"/>
-    </w:rPr>
     <w:tblPr>
       <w:tblInd w:type="dxa" w:w="0"/>
       <w:tblCellMar>
@@ -1050,42 +640,25 @@
     <w:pPr>
       <w:keepNext/>
       <w:keepLines/>
-      <w:spacing w:after="0" w:line="276" w:lineRule="auto"/>
-      <w:jc w:val="both"/>
-    </w:pPr>
-    <w:rPr>
-      <w:rFonts w:ascii="Times New Roman" w:eastAsia="Times New Roman" w:hAnsi="Times New Roman"/>
-      <w:b/>
-      <w:color w:val="000000"/>
-      <w:sz w:val="24"/>
+      <w:spacing w:after="0"/>
+    </w:pPr>
+    <w:rPr>
+      <w:b/>
     </w:rPr>
   </w:style>
   <w:style w:customStyle="1" w:styleId="Definition" w:type="paragraph">
     <w:name w:val="Definition"/>
     <w:basedOn w:val="Normal"/>
-    <w:pPr>
-      <w:spacing w:line="276" w:lineRule="auto"/>
-      <w:jc w:val="both"/>
-    </w:pPr>
-    <w:rPr>
-      <w:rFonts w:ascii="Times New Roman" w:eastAsia="Times New Roman" w:hAnsi="Times New Roman"/>
-      <w:color w:val="000000"/>
-      <w:sz w:val="24"/>
-    </w:rPr>
   </w:style>
   <w:style w:styleId="Caption" w:type="paragraph">
     <w:name w:val="Caption"/>
     <w:basedOn w:val="Normal"/>
     <w:link w:val="BodyTextChar"/>
     <w:pPr>
-      <w:spacing w:after="120" w:before="0" w:line="276" w:lineRule="auto"/>
-      <w:jc w:val="both"/>
-    </w:pPr>
-    <w:rPr>
-      <w:rFonts w:ascii="Times New Roman" w:eastAsia="Times New Roman" w:hAnsi="Times New Roman"/>
+      <w:spacing w:after="120" w:before="0"/>
+    </w:pPr>
+    <w:rPr>
       <w:i/>
-      <w:color w:val="000000"/>
-      <w:sz w:val="24"/>
     </w:rPr>
   </w:style>
   <w:style w:customStyle="1" w:styleId="TableCaption" w:type="paragraph">
@@ -1093,90 +666,44 @@
     <w:basedOn w:val="Caption"/>
     <w:pPr>
       <w:keepNext/>
-      <w:spacing w:line="276" w:lineRule="auto"/>
-      <w:jc w:val="both"/>
-    </w:pPr>
-    <w:rPr>
-      <w:rFonts w:ascii="Times New Roman" w:eastAsia="Times New Roman" w:hAnsi="Times New Roman"/>
-      <w:color w:val="000000"/>
-      <w:sz w:val="24"/>
-    </w:rPr>
+    </w:pPr>
   </w:style>
   <w:style w:customStyle="1" w:styleId="ImageCaption" w:type="paragraph">
     <w:name w:val="Image Caption"/>
     <w:basedOn w:val="Caption"/>
-    <w:pPr>
-      <w:spacing w:line="276" w:lineRule="auto"/>
-      <w:jc w:val="both"/>
-    </w:pPr>
-    <w:rPr>
-      <w:rFonts w:ascii="Times New Roman" w:eastAsia="Times New Roman" w:hAnsi="Times New Roman"/>
-      <w:color w:val="000000"/>
-      <w:sz w:val="24"/>
-    </w:rPr>
   </w:style>
   <w:style w:customStyle="1" w:styleId="Figure" w:type="paragraph">
     <w:name w:val="Figure"/>
     <w:basedOn w:val="Normal"/>
-    <w:pPr>
-      <w:spacing w:line="276" w:lineRule="auto"/>
-      <w:jc w:val="both"/>
-    </w:pPr>
-    <w:rPr>
-      <w:rFonts w:ascii="Times New Roman" w:eastAsia="Times New Roman" w:hAnsi="Times New Roman"/>
-      <w:color w:val="000000"/>
-      <w:sz w:val="24"/>
-    </w:rPr>
   </w:style>
   <w:style w:customStyle="1" w:styleId="CaptionedFigure" w:type="paragraph">
     <w:name w:val="Captioned Figure"/>
     <w:basedOn w:val="Figure"/>
     <w:pPr>
       <w:keepNext/>
-      <w:spacing w:line="276" w:lineRule="auto"/>
-      <w:jc w:val="both"/>
-    </w:pPr>
-    <w:rPr>
-      <w:rFonts w:ascii="Times New Roman" w:eastAsia="Times New Roman" w:hAnsi="Times New Roman"/>
-      <w:color w:val="000000"/>
-      <w:sz w:val="24"/>
-    </w:rPr>
+    </w:pPr>
   </w:style>
   <w:style w:customStyle="1" w:styleId="BodyTextChar" w:type="character">
     <w:name w:val="Body Text Char"/>
     <w:basedOn w:val="DefaultParagraphFont"/>
     <w:link w:val="BodyText"/>
-    <w:rPr>
-      <w:rFonts w:ascii="Times New Roman" w:eastAsia="Times New Roman" w:hAnsi="Times New Roman"/>
-      <w:color w:val="000000"/>
-      <w:sz w:val="24"/>
-    </w:rPr>
   </w:style>
   <w:style w:customStyle="1" w:styleId="VerbatimChar" w:type="character">
     <w:name w:val="Verbatim Char"/>
     <w:basedOn w:val="BodyTextChar"/>
     <w:rPr>
-      <w:rFonts w:ascii="Times New Roman" w:eastAsia="Times New Roman" w:hAnsi="Times New Roman"/>
-      <w:color w:val="000000"/>
-      <w:sz w:val="24"/>
+      <w:rFonts w:ascii="Consolas" w:hAnsi="Consolas"/>
+      <w:sz w:val="22"/>
     </w:rPr>
   </w:style>
   <w:style w:customStyle="1" w:styleId="SectionNumber" w:type="character">
     <w:name w:val="Section Number"/>
     <w:basedOn w:val="BodyTextChar"/>
-    <w:rPr>
-      <w:rFonts w:ascii="Times New Roman" w:eastAsia="Times New Roman" w:hAnsi="Times New Roman"/>
-      <w:color w:val="000000"/>
-      <w:sz w:val="24"/>
-    </w:rPr>
   </w:style>
   <w:style w:styleId="FootnoteReference" w:type="character">
     <w:name w:val="Footnote Reference"/>
     <w:basedOn w:val="BodyTextChar"/>
     <w:rPr>
-      <w:rFonts w:ascii="Times New Roman" w:eastAsia="Times New Roman" w:hAnsi="Times New Roman"/>
-      <w:color w:val="000000"/>
-      <w:sz w:val="24"/>
       <w:vertAlign w:val="superscript"/>
     </w:rPr>
   </w:style>
@@ -1184,9 +711,7 @@
     <w:name w:val="Hyperlink"/>
     <w:basedOn w:val="BodyTextChar"/>
     <w:rPr>
-      <w:rFonts w:ascii="Times New Roman" w:eastAsia="Times New Roman" w:hAnsi="Times New Roman"/>
-      <w:color w:val="000000"/>
-      <w:sz w:val="24"/>
+      <w:color w:themeColor="accent1" w:val="4F81BD"/>
     </w:rPr>
   </w:style>
   <w:style w:styleId="TOCHeading" w:type="paragraph">
@@ -1197,16 +722,14 @@
     <w:unhideWhenUsed/>
     <w:qFormat/>
     <w:pPr>
-      <w:spacing w:before="240" w:line="276" w:lineRule="auto"/>
-      <w:jc w:val="both"/>
+      <w:spacing w:before="240" w:line="259" w:lineRule="auto"/>
       <w:outlineLvl w:val="9"/>
     </w:pPr>
     <w:rPr>
-      <w:rFonts w:ascii="Times New Roman" w:asciiTheme="majorHAnsi" w:cstheme="majorBidi" w:eastAsia="Times New Roman" w:eastAsiaTheme="majorEastAsia" w:hAnsi="Times New Roman" w:hAnsiTheme="majorHAnsi"/>
+      <w:rFonts w:asciiTheme="majorHAnsi" w:cstheme="majorBidi" w:eastAsiaTheme="majorEastAsia" w:hAnsiTheme="majorHAnsi"/>
       <w:b w:val="0"/>
       <w:bCs w:val="0"/>
-      <w:color w:val="000000"/>
-      <w:sz w:val="24"/>
+      <w:color w:themeColor="accent1" w:themeShade="BF" w:val="365F91"/>
     </w:rPr>
   </w:style>
   <w:style w:type="paragraph" w:customStyle="1" w:styleId="SourceCode">

</xml_diff>